<commit_message>
Add PhD dates and publications to the CV and site
PhD Candidate, Department of Data Science, NMBU (Mar 2024 – Mar 2027).
Publications: FragFM (NIK 2025) and HADL (arXiv:2502.10569). Keep CV
headings with their first entry across page breaks.

Co-Authored-By: Claude Opus 5.5 (1M context) <noreply@anthropic.com>
Claude-Session: https://claude.ai/code/session_01VWPWPZCGczM8BzTyJkuRwJ
</commit_message>
<xml_diff>
--- a/resume/Aditya_Dey_Resume.docx
+++ b/resume/Aditya_Dey_Resume.docx
@@ -45,7 +45,7 @@
         </w:rPr>
         <w:t xml:space="preserve">E-mail: </w:t>
       </w:r>
-      <w:hyperlink w:history="1" r:id="rIdtvehkasqdlcw0sv2knbjc">
+      <w:hyperlink w:history="1" r:id="rIda5mtexy8nhlkum9pw87na">
         <w:r>
           <w:rPr>
             <w:rStyle w:val="Hyperlink"/>
@@ -70,7 +70,7 @@
         </w:rPr>
         <w:t xml:space="preserve">LinkedIn: </w:t>
       </w:r>
-      <w:hyperlink w:history="1" r:id="rIdqnil-i4xwc-foyhmok-db">
+      <w:hyperlink w:history="1" r:id="rIdcvpw69oemdz-aoqs4fd7q">
         <w:r>
           <w:rPr>
             <w:rStyle w:val="Hyperlink"/>
@@ -95,7 +95,7 @@
         </w:rPr>
         <w:t xml:space="preserve">Google Scholar: </w:t>
       </w:r>
-      <w:hyperlink w:history="1" r:id="rId9o4t4kb18xzvpktejuodq">
+      <w:hyperlink w:history="1" r:id="rId-brxgwxmzo3mi6f-tv8eq">
         <w:r>
           <w:rPr>
             <w:rStyle w:val="Hyperlink"/>
@@ -120,7 +120,7 @@
         </w:rPr>
         <w:t xml:space="preserve">GitHub: </w:t>
       </w:r>
-      <w:hyperlink w:history="1" r:id="rIdyceplfmxwtniggluycg5x">
+      <w:hyperlink w:history="1" r:id="rId_-assr4exqiz34ddf6rjk">
         <w:r>
           <w:rPr>
             <w:rStyle w:val="Hyperlink"/>
@@ -139,7 +139,7 @@
         </w:rPr>
         <w:t xml:space="preserve">  |  Website: </w:t>
       </w:r>
-      <w:hyperlink w:history="1" r:id="rIdmm0vatodpnxu2ktohkfrj">
+      <w:hyperlink w:history="1" r:id="rId-2mujqqhxrdrwcmojf1gg">
         <w:r>
           <w:rPr>
             <w:rStyle w:val="Hyperlink"/>
@@ -153,6 +153,7 @@
     </w:p>
     <w:p>
       <w:pPr>
+        <w:keepNext/>
         <w:pBdr>
           <w:bottom w:val="single" w:color="000000" w:sz="6" w:space="1"/>
         </w:pBdr>
@@ -182,6 +183,7 @@
     </w:p>
     <w:p>
       <w:pPr>
+        <w:keepNext/>
         <w:pBdr>
           <w:bottom w:val="single" w:color="000000" w:sz="6" w:space="1"/>
         </w:pBdr>
@@ -198,6 +200,7 @@
     </w:p>
     <w:p>
       <w:pPr>
+        <w:keepNext/>
         <w:tabs>
           <w:tab w:val="left" w:pos="1900"/>
           <w:tab w:val="right" w:pos="9070"/>
@@ -210,7 +213,7 @@
           <w:sz w:val="18"/>
           <w:szCs w:val="18"/>
         </w:rPr>
-        <w:t xml:space="preserve">[Mon YYYY] – present</w:t>
+        <w:t xml:space="preserve">Mar 2024 – Mar 2027</w:t>
       </w:r>
       <w:r>
         <w:rPr>
@@ -228,7 +231,7 @@
           <w:sz w:val="22"/>
           <w:szCs w:val="22"/>
         </w:rPr>
-        <w:t xml:space="preserve">PhD, [programme]</w:t>
+        <w:t xml:space="preserve">PhD Candidate, Department of Data Science</w:t>
       </w:r>
       <w:r>
         <w:rPr>
@@ -244,7 +247,7 @@
           <w:sz w:val="18"/>
           <w:szCs w:val="18"/>
         </w:rPr>
-        <w:t xml:space="preserve">[University]</w:t>
+        <w:t xml:space="preserve">NMBU, Norway</w:t>
       </w:r>
     </w:p>
     <w:p>
@@ -287,6 +290,7 @@
     </w:p>
     <w:p>
       <w:pPr>
+        <w:keepNext/>
         <w:tabs>
           <w:tab w:val="left" w:pos="1900"/>
           <w:tab w:val="right" w:pos="9070"/>
@@ -366,6 +370,7 @@
     </w:p>
     <w:p>
       <w:pPr>
+        <w:keepNext/>
         <w:pBdr>
           <w:bottom w:val="single" w:color="000000" w:sz="6" w:space="1"/>
         </w:pBdr>
@@ -578,6 +583,7 @@
     </w:p>
     <w:p>
       <w:pPr>
+        <w:keepNext/>
         <w:pBdr>
           <w:bottom w:val="single" w:color="000000" w:sz="6" w:space="1"/>
         </w:pBdr>
@@ -590,6 +596,372 @@
           <w:szCs w:val="24"/>
         </w:rPr>
         <w:t xml:space="preserve">PUBLICATIONS</w:t>
+      </w:r>
+    </w:p>
+    <w:p>
+      <w:pPr>
+        <w:pStyle w:val="ListParagraph"/>
+        <w:numPr>
+          <w:ilvl w:val="0"/>
+          <w:numId w:val="2"/>
+        </w:numPr>
+        <w:spacing w:after="60"/>
+      </w:pPr>
+      <w:r>
+        <w:rPr>
+          <w:rFonts w:ascii="Calibri" w:cs="Calibri" w:eastAsia="Calibri" w:hAnsi="Calibri"/>
+          <w:b/>
+          <w:bCs/>
+          <w:sz w:val="20"/>
+          <w:szCs w:val="20"/>
+        </w:rPr>
+        <w:t xml:space="preserve">A. Dey</w:t>
+      </w:r>
+      <w:r>
+        <w:rPr>
+          <w:rFonts w:ascii="Calibri" w:cs="Calibri" w:eastAsia="Calibri" w:hAnsi="Calibri"/>
+          <w:sz w:val="20"/>
+          <w:szCs w:val="20"/>
+        </w:rPr>
+        <w:t xml:space="preserve">, J. Kusch, F. Al Machot. </w:t>
+      </w:r>
+      <w:r>
+        <w:rPr>
+          <w:rFonts w:ascii="Calibri" w:cs="Calibri" w:eastAsia="Calibri" w:hAnsi="Calibri"/>
+          <w:sz w:val="20"/>
+          <w:szCs w:val="20"/>
+        </w:rPr>
+        <w:t xml:space="preserve">FragFM: Fragmented Fourier Matrix for multi-seasonality extraction in Univariate Long-Term Time Series Forecasting. </w:t>
+      </w:r>
+      <w:r>
+        <w:rPr>
+          <w:rFonts w:ascii="Calibri" w:cs="Calibri" w:eastAsia="Calibri" w:hAnsi="Calibri"/>
+          <w:i/>
+          <w:iCs/>
+          <w:sz w:val="20"/>
+          <w:szCs w:val="20"/>
+        </w:rPr>
+        <w:t xml:space="preserve">Norsk IKT-konferanse for forskning og utdanning (NIK 2025), Nov 2025.</w:t>
+      </w:r>
+    </w:p>
+    <w:p>
+      <w:pPr>
+        <w:pStyle w:val="ListParagraph"/>
+        <w:numPr>
+          <w:ilvl w:val="0"/>
+          <w:numId w:val="2"/>
+        </w:numPr>
+        <w:spacing w:after="60"/>
+      </w:pPr>
+      <w:r>
+        <w:rPr>
+          <w:rFonts w:ascii="Calibri" w:cs="Calibri" w:eastAsia="Calibri" w:hAnsi="Calibri"/>
+          <w:b/>
+          <w:bCs/>
+          <w:sz w:val="20"/>
+          <w:szCs w:val="20"/>
+        </w:rPr>
+        <w:t xml:space="preserve">A. Dey</w:t>
+      </w:r>
+      <w:r>
+        <w:rPr>
+          <w:rFonts w:ascii="Calibri" w:cs="Calibri" w:eastAsia="Calibri" w:hAnsi="Calibri"/>
+          <w:sz w:val="20"/>
+          <w:szCs w:val="20"/>
+        </w:rPr>
+        <w:t xml:space="preserve">, J. Kusch, F. Al Machot. </w:t>
+      </w:r>
+      <w:r>
+        <w:rPr>
+          <w:rFonts w:ascii="Calibri" w:cs="Calibri" w:eastAsia="Calibri" w:hAnsi="Calibri"/>
+          <w:sz w:val="20"/>
+          <w:szCs w:val="20"/>
+        </w:rPr>
+        <w:t xml:space="preserve">HADL Framework for Noise Resilient Long-Term Time Series Forecasting. </w:t>
+      </w:r>
+      <w:r>
+        <w:rPr>
+          <w:rFonts w:ascii="Calibri" w:cs="Calibri" w:eastAsia="Calibri" w:hAnsi="Calibri"/>
+          <w:i/>
+          <w:iCs/>
+          <w:sz w:val="20"/>
+          <w:szCs w:val="20"/>
+        </w:rPr>
+        <w:t xml:space="preserve">arXiv:2502.10569, Feb 2025.</w:t>
+      </w:r>
+    </w:p>
+    <w:p>
+      <w:pPr>
+        <w:keepNext/>
+        <w:pBdr>
+          <w:bottom w:val="single" w:color="000000" w:sz="6" w:space="1"/>
+        </w:pBdr>
+        <w:spacing w:after="120" w:before="280"/>
+      </w:pPr>
+      <w:r>
+        <w:rPr>
+          <w:rFonts w:ascii="Calibri" w:cs="Calibri" w:eastAsia="Calibri" w:hAnsi="Calibri"/>
+          <w:sz w:val="24"/>
+          <w:szCs w:val="24"/>
+        </w:rPr>
+        <w:t xml:space="preserve">CONSULTING EXPERIENCE</w:t>
+      </w:r>
+    </w:p>
+    <w:p>
+      <w:pPr>
+        <w:keepNext/>
+        <w:tabs>
+          <w:tab w:val="left" w:pos="1900"/>
+          <w:tab w:val="right" w:pos="9070"/>
+        </w:tabs>
+        <w:spacing w:after="20" w:before="160"/>
+      </w:pPr>
+      <w:r>
+        <w:rPr>
+          <w:rFonts w:ascii="Calibri" w:cs="Calibri" w:eastAsia="Calibri" w:hAnsi="Calibri"/>
+          <w:sz w:val="18"/>
+          <w:szCs w:val="18"/>
+        </w:rPr>
+        <w:t xml:space="preserve">Sep 2019 – Aug 2021</w:t>
+      </w:r>
+      <w:r>
+        <w:rPr>
+          <w:rFonts w:ascii="Calibri" w:cs="Calibri" w:eastAsia="Calibri" w:hAnsi="Calibri"/>
+          <w:sz w:val="20"/>
+          <w:szCs w:val="20"/>
+        </w:rPr>
+        <w:t xml:space="preserve">	</w:t>
+      </w:r>
+      <w:r>
+        <w:rPr>
+          <w:rFonts w:ascii="Calibri" w:cs="Calibri" w:eastAsia="Calibri" w:hAnsi="Calibri"/>
+          <w:b/>
+          <w:bCs/>
+          <w:sz w:val="22"/>
+          <w:szCs w:val="22"/>
+        </w:rPr>
+        <w:t xml:space="preserve">Data Analyst</w:t>
+      </w:r>
+      <w:r>
+        <w:rPr>
+          <w:rFonts w:ascii="Calibri" w:cs="Calibri" w:eastAsia="Calibri" w:hAnsi="Calibri"/>
+          <w:sz w:val="20"/>
+          <w:szCs w:val="20"/>
+        </w:rPr>
+        <w:t xml:space="preserve">	</w:t>
+      </w:r>
+      <w:r>
+        <w:rPr>
+          <w:rFonts w:ascii="Calibri" w:cs="Calibri" w:eastAsia="Calibri" w:hAnsi="Calibri"/>
+          <w:sz w:val="18"/>
+          <w:szCs w:val="18"/>
+        </w:rPr>
+        <w:t xml:space="preserve">Mastercard, India</w:t>
+      </w:r>
+    </w:p>
+    <w:p>
+      <w:pPr>
+        <w:spacing w:after="20"/>
+        <w:ind w:left="1900"/>
+      </w:pPr>
+      <w:r>
+        <w:rPr>
+          <w:rFonts w:ascii="Calibri" w:cs="Calibri" w:eastAsia="Calibri" w:hAnsi="Calibri"/>
+          <w:sz w:val="19"/>
+          <w:szCs w:val="19"/>
+        </w:rPr>
+        <w:t xml:space="preserve">Built data pipelines combining BigQuery, Oracle SQL and PySpark; modelled star and SCD schemas.</w:t>
+      </w:r>
+    </w:p>
+    <w:p>
+      <w:pPr>
+        <w:spacing w:after="20"/>
+        <w:ind w:left="1900"/>
+      </w:pPr>
+      <w:r>
+        <w:rPr>
+          <w:rFonts w:ascii="Calibri" w:cs="Calibri" w:eastAsia="Calibri" w:hAnsi="Calibri"/>
+          <w:sz w:val="19"/>
+          <w:szCs w:val="19"/>
+        </w:rPr>
+        <w:t xml:space="preserve">Planned and delivered Power BI reports with VPs and application leads, including regression analyses; validated data and reports monthly.</w:t>
+      </w:r>
+    </w:p>
+    <w:p>
+      <w:pPr>
+        <w:keepNext/>
+        <w:tabs>
+          <w:tab w:val="left" w:pos="1900"/>
+          <w:tab w:val="right" w:pos="9070"/>
+        </w:tabs>
+        <w:spacing w:after="20" w:before="160"/>
+      </w:pPr>
+      <w:r>
+        <w:rPr>
+          <w:rFonts w:ascii="Calibri" w:cs="Calibri" w:eastAsia="Calibri" w:hAnsi="Calibri"/>
+          <w:sz w:val="18"/>
+          <w:szCs w:val="18"/>
+        </w:rPr>
+        <w:t xml:space="preserve">Sep 2018 – Sep 2019</w:t>
+      </w:r>
+      <w:r>
+        <w:rPr>
+          <w:rFonts w:ascii="Calibri" w:cs="Calibri" w:eastAsia="Calibri" w:hAnsi="Calibri"/>
+          <w:sz w:val="20"/>
+          <w:szCs w:val="20"/>
+        </w:rPr>
+        <w:t xml:space="preserve">	</w:t>
+      </w:r>
+      <w:r>
+        <w:rPr>
+          <w:rFonts w:ascii="Calibri" w:cs="Calibri" w:eastAsia="Calibri" w:hAnsi="Calibri"/>
+          <w:b/>
+          <w:bCs/>
+          <w:sz w:val="22"/>
+          <w:szCs w:val="22"/>
+        </w:rPr>
+        <w:t xml:space="preserve">Application Lead</w:t>
+      </w:r>
+      <w:r>
+        <w:rPr>
+          <w:rFonts w:ascii="Calibri" w:cs="Calibri" w:eastAsia="Calibri" w:hAnsi="Calibri"/>
+          <w:sz w:val="20"/>
+          <w:szCs w:val="20"/>
+        </w:rPr>
+        <w:t xml:space="preserve">	</w:t>
+      </w:r>
+      <w:r>
+        <w:rPr>
+          <w:rFonts w:ascii="Calibri" w:cs="Calibri" w:eastAsia="Calibri" w:hAnsi="Calibri"/>
+          <w:sz w:val="18"/>
+          <w:szCs w:val="18"/>
+        </w:rPr>
+        <w:t xml:space="preserve">Cognizant, India</w:t>
+      </w:r>
+    </w:p>
+    <w:p>
+      <w:pPr>
+        <w:spacing w:after="20"/>
+        <w:ind w:left="1900"/>
+      </w:pPr>
+      <w:r>
+        <w:rPr>
+          <w:rFonts w:ascii="Calibri" w:cs="Calibri" w:eastAsia="Calibri" w:hAnsi="Calibri"/>
+          <w:sz w:val="19"/>
+          <w:szCs w:val="19"/>
+        </w:rPr>
+        <w:t xml:space="preserve">Ran Master Data Management reporting across multiple databases and maintained Informatica ETL pipelines with SQL and Python.</w:t>
+      </w:r>
+    </w:p>
+    <w:p>
+      <w:pPr>
+        <w:spacing w:after="20"/>
+        <w:ind w:left="1900"/>
+      </w:pPr>
+      <w:r>
+        <w:rPr>
+          <w:rFonts w:ascii="Calibri" w:cs="Calibri" w:eastAsia="Calibri" w:hAnsi="Calibri"/>
+          <w:sz w:val="19"/>
+          <w:szCs w:val="19"/>
+        </w:rPr>
+        <w:t xml:space="preserve">Led Python, Informatica and Oracle upgrades and migrations, and optimised existing queries to cut redundancy.</w:t>
+      </w:r>
+    </w:p>
+    <w:p>
+      <w:pPr>
+        <w:keepNext/>
+        <w:tabs>
+          <w:tab w:val="left" w:pos="1900"/>
+          <w:tab w:val="right" w:pos="9070"/>
+        </w:tabs>
+        <w:spacing w:after="20" w:before="160"/>
+      </w:pPr>
+      <w:r>
+        <w:rPr>
+          <w:rFonts w:ascii="Calibri" w:cs="Calibri" w:eastAsia="Calibri" w:hAnsi="Calibri"/>
+          <w:sz w:val="18"/>
+          <w:szCs w:val="18"/>
+        </w:rPr>
+        <w:t xml:space="preserve">Aug 2012 – Sep 2018</w:t>
+      </w:r>
+      <w:r>
+        <w:rPr>
+          <w:rFonts w:ascii="Calibri" w:cs="Calibri" w:eastAsia="Calibri" w:hAnsi="Calibri"/>
+          <w:sz w:val="20"/>
+          <w:szCs w:val="20"/>
+        </w:rPr>
+        <w:t xml:space="preserve">	</w:t>
+      </w:r>
+      <w:r>
+        <w:rPr>
+          <w:rFonts w:ascii="Calibri" w:cs="Calibri" w:eastAsia="Calibri" w:hAnsi="Calibri"/>
+          <w:b/>
+          <w:bCs/>
+          <w:sz w:val="22"/>
+          <w:szCs w:val="22"/>
+        </w:rPr>
+        <w:t xml:space="preserve">Application Lead</w:t>
+      </w:r>
+      <w:r>
+        <w:rPr>
+          <w:rFonts w:ascii="Calibri" w:cs="Calibri" w:eastAsia="Calibri" w:hAnsi="Calibri"/>
+          <w:sz w:val="20"/>
+          <w:szCs w:val="20"/>
+        </w:rPr>
+        <w:t xml:space="preserve">	</w:t>
+      </w:r>
+      <w:r>
+        <w:rPr>
+          <w:rFonts w:ascii="Calibri" w:cs="Calibri" w:eastAsia="Calibri" w:hAnsi="Calibri"/>
+          <w:sz w:val="18"/>
+          <w:szCs w:val="18"/>
+        </w:rPr>
+        <w:t xml:space="preserve">LTIMindtree, India</w:t>
+      </w:r>
+    </w:p>
+    <w:p>
+      <w:pPr>
+        <w:spacing w:after="20"/>
+        <w:ind w:left="1900"/>
+      </w:pPr>
+      <w:r>
+        <w:rPr>
+          <w:rFonts w:ascii="Calibri" w:cs="Calibri" w:eastAsia="Calibri" w:hAnsi="Calibri"/>
+          <w:sz w:val="19"/>
+          <w:szCs w:val="19"/>
+        </w:rPr>
+        <w:t xml:space="preserve">Managed production, UAT and business sign-offs, and coordinated releases through CAB meetings.</w:t>
+      </w:r>
+    </w:p>
+    <w:p>
+      <w:pPr>
+        <w:spacing w:after="20"/>
+        <w:ind w:left="1900"/>
+      </w:pPr>
+      <w:r>
+        <w:rPr>
+          <w:rFonts w:ascii="Calibri" w:cs="Calibri" w:eastAsia="Calibri" w:hAnsi="Calibri"/>
+          <w:sz w:val="19"/>
+          <w:szCs w:val="19"/>
+        </w:rPr>
+        <w:t xml:space="preserve">Resolved defects in shell and Python scripts and Oracle PL/SQL, using SQL tracing to locate faulty procedures and triggers.</w:t>
+      </w:r>
+    </w:p>
+    <w:p>
+      <w:pPr>
+        <w:keepNext/>
+        <w:pBdr>
+          <w:bottom w:val="single" w:color="000000" w:sz="6" w:space="1"/>
+        </w:pBdr>
+        <w:spacing w:after="120" w:before="280"/>
+      </w:pPr>
+      <w:r>
+        <w:rPr>
+          <w:rFonts w:ascii="Calibri" w:cs="Calibri" w:eastAsia="Calibri" w:hAnsi="Calibri"/>
+          <w:sz w:val="24"/>
+          <w:szCs w:val="24"/>
+        </w:rPr>
+        <w:t xml:space="preserve">LANGUAGE SKILLS</w:t>
       </w:r>
     </w:p>
     <w:p>
@@ -604,279 +976,20 @@
       <w:r>
         <w:rPr>
           <w:rFonts w:ascii="Calibri" w:cs="Calibri" w:eastAsia="Calibri" w:hAnsi="Calibri"/>
-          <w:sz w:val="20"/>
-          <w:szCs w:val="20"/>
-        </w:rPr>
-        <w:t xml:space="preserve">[Full citations with Aditya Dey in bold; see Google Scholar profile above]</w:t>
-      </w:r>
-    </w:p>
-    <w:p>
-      <w:pPr>
-        <w:pBdr>
-          <w:bottom w:val="single" w:color="000000" w:sz="6" w:space="1"/>
-        </w:pBdr>
-        <w:spacing w:after="120" w:before="280"/>
-      </w:pPr>
-      <w:r>
-        <w:rPr>
-          <w:rFonts w:ascii="Calibri" w:cs="Calibri" w:eastAsia="Calibri" w:hAnsi="Calibri"/>
-          <w:sz w:val="24"/>
-          <w:szCs w:val="24"/>
-        </w:rPr>
-        <w:t xml:space="preserve">CONSULTING EXPERIENCE</w:t>
-      </w:r>
-    </w:p>
-    <w:p>
-      <w:pPr>
-        <w:tabs>
-          <w:tab w:val="left" w:pos="1900"/>
-          <w:tab w:val="right" w:pos="9070"/>
-        </w:tabs>
-        <w:spacing w:after="20" w:before="160"/>
-      </w:pPr>
-      <w:r>
-        <w:rPr>
-          <w:rFonts w:ascii="Calibri" w:cs="Calibri" w:eastAsia="Calibri" w:hAnsi="Calibri"/>
-          <w:sz w:val="18"/>
-          <w:szCs w:val="18"/>
-        </w:rPr>
-        <w:t xml:space="preserve">Sep 2019 – Aug 2021</w:t>
-      </w:r>
-      <w:r>
-        <w:rPr>
-          <w:rFonts w:ascii="Calibri" w:cs="Calibri" w:eastAsia="Calibri" w:hAnsi="Calibri"/>
-          <w:sz w:val="20"/>
-          <w:szCs w:val="20"/>
-        </w:rPr>
-        <w:t xml:space="preserve">	</w:t>
-      </w:r>
-      <w:r>
-        <w:rPr>
-          <w:rFonts w:ascii="Calibri" w:cs="Calibri" w:eastAsia="Calibri" w:hAnsi="Calibri"/>
-          <w:b/>
-          <w:bCs/>
-          <w:sz w:val="22"/>
-          <w:szCs w:val="22"/>
-        </w:rPr>
-        <w:t xml:space="preserve">Data Analyst</w:t>
-      </w:r>
-      <w:r>
-        <w:rPr>
-          <w:rFonts w:ascii="Calibri" w:cs="Calibri" w:eastAsia="Calibri" w:hAnsi="Calibri"/>
-          <w:sz w:val="20"/>
-          <w:szCs w:val="20"/>
-        </w:rPr>
-        <w:t xml:space="preserve">	</w:t>
-      </w:r>
-      <w:r>
-        <w:rPr>
-          <w:rFonts w:ascii="Calibri" w:cs="Calibri" w:eastAsia="Calibri" w:hAnsi="Calibri"/>
-          <w:sz w:val="18"/>
-          <w:szCs w:val="18"/>
-        </w:rPr>
-        <w:t xml:space="preserve">Mastercard, India</w:t>
-      </w:r>
-    </w:p>
-    <w:p>
-      <w:pPr>
-        <w:spacing w:after="20"/>
-        <w:ind w:left="1900"/>
-      </w:pPr>
-      <w:r>
-        <w:rPr>
-          <w:rFonts w:ascii="Calibri" w:cs="Calibri" w:eastAsia="Calibri" w:hAnsi="Calibri"/>
-          <w:sz w:val="19"/>
-          <w:szCs w:val="19"/>
-        </w:rPr>
-        <w:t xml:space="preserve">Built data pipelines combining BigQuery, Oracle SQL and PySpark; modelled star and SCD schemas.</w:t>
-      </w:r>
-    </w:p>
-    <w:p>
-      <w:pPr>
-        <w:spacing w:after="20"/>
-        <w:ind w:left="1900"/>
-      </w:pPr>
-      <w:r>
-        <w:rPr>
-          <w:rFonts w:ascii="Calibri" w:cs="Calibri" w:eastAsia="Calibri" w:hAnsi="Calibri"/>
-          <w:sz w:val="19"/>
-          <w:szCs w:val="19"/>
-        </w:rPr>
-        <w:t xml:space="preserve">Planned and delivered Power BI reports with VPs and application leads, including regression analyses; validated data and reports monthly.</w:t>
-      </w:r>
-    </w:p>
-    <w:p>
-      <w:pPr>
-        <w:tabs>
-          <w:tab w:val="left" w:pos="1900"/>
-          <w:tab w:val="right" w:pos="9070"/>
-        </w:tabs>
-        <w:spacing w:after="20" w:before="160"/>
-      </w:pPr>
-      <w:r>
-        <w:rPr>
-          <w:rFonts w:ascii="Calibri" w:cs="Calibri" w:eastAsia="Calibri" w:hAnsi="Calibri"/>
-          <w:sz w:val="18"/>
-          <w:szCs w:val="18"/>
-        </w:rPr>
-        <w:t xml:space="preserve">Sep 2018 – Sep 2019</w:t>
-      </w:r>
-      <w:r>
-        <w:rPr>
-          <w:rFonts w:ascii="Calibri" w:cs="Calibri" w:eastAsia="Calibri" w:hAnsi="Calibri"/>
-          <w:sz w:val="20"/>
-          <w:szCs w:val="20"/>
-        </w:rPr>
-        <w:t xml:space="preserve">	</w:t>
-      </w:r>
-      <w:r>
-        <w:rPr>
-          <w:rFonts w:ascii="Calibri" w:cs="Calibri" w:eastAsia="Calibri" w:hAnsi="Calibri"/>
-          <w:b/>
-          <w:bCs/>
-          <w:sz w:val="22"/>
-          <w:szCs w:val="22"/>
-        </w:rPr>
-        <w:t xml:space="preserve">Application Lead</w:t>
-      </w:r>
-      <w:r>
-        <w:rPr>
-          <w:rFonts w:ascii="Calibri" w:cs="Calibri" w:eastAsia="Calibri" w:hAnsi="Calibri"/>
-          <w:sz w:val="20"/>
-          <w:szCs w:val="20"/>
-        </w:rPr>
-        <w:t xml:space="preserve">	</w:t>
-      </w:r>
-      <w:r>
-        <w:rPr>
-          <w:rFonts w:ascii="Calibri" w:cs="Calibri" w:eastAsia="Calibri" w:hAnsi="Calibri"/>
-          <w:sz w:val="18"/>
-          <w:szCs w:val="18"/>
-        </w:rPr>
-        <w:t xml:space="preserve">Cognizant, India</w:t>
-      </w:r>
-    </w:p>
-    <w:p>
-      <w:pPr>
-        <w:spacing w:after="20"/>
-        <w:ind w:left="1900"/>
-      </w:pPr>
-      <w:r>
-        <w:rPr>
-          <w:rFonts w:ascii="Calibri" w:cs="Calibri" w:eastAsia="Calibri" w:hAnsi="Calibri"/>
-          <w:sz w:val="19"/>
-          <w:szCs w:val="19"/>
-        </w:rPr>
-        <w:t xml:space="preserve">Ran Master Data Management reporting across multiple databases and maintained Informatica ETL pipelines with SQL and Python.</w:t>
-      </w:r>
-    </w:p>
-    <w:p>
-      <w:pPr>
-        <w:spacing w:after="20"/>
-        <w:ind w:left="1900"/>
-      </w:pPr>
-      <w:r>
-        <w:rPr>
-          <w:rFonts w:ascii="Calibri" w:cs="Calibri" w:eastAsia="Calibri" w:hAnsi="Calibri"/>
-          <w:sz w:val="19"/>
-          <w:szCs w:val="19"/>
-        </w:rPr>
-        <w:t xml:space="preserve">Led Python, Informatica and Oracle upgrades and migrations, and optimised existing queries to cut redundancy.</w:t>
-      </w:r>
-    </w:p>
-    <w:p>
-      <w:pPr>
-        <w:tabs>
-          <w:tab w:val="left" w:pos="1900"/>
-          <w:tab w:val="right" w:pos="9070"/>
-        </w:tabs>
-        <w:spacing w:after="20" w:before="160"/>
-      </w:pPr>
-      <w:r>
-        <w:rPr>
-          <w:rFonts w:ascii="Calibri" w:cs="Calibri" w:eastAsia="Calibri" w:hAnsi="Calibri"/>
-          <w:sz w:val="18"/>
-          <w:szCs w:val="18"/>
-        </w:rPr>
-        <w:t xml:space="preserve">Aug 2012 – Sep 2018</w:t>
-      </w:r>
-      <w:r>
-        <w:rPr>
-          <w:rFonts w:ascii="Calibri" w:cs="Calibri" w:eastAsia="Calibri" w:hAnsi="Calibri"/>
-          <w:sz w:val="20"/>
-          <w:szCs w:val="20"/>
-        </w:rPr>
-        <w:t xml:space="preserve">	</w:t>
-      </w:r>
-      <w:r>
-        <w:rPr>
-          <w:rFonts w:ascii="Calibri" w:cs="Calibri" w:eastAsia="Calibri" w:hAnsi="Calibri"/>
-          <w:b/>
-          <w:bCs/>
-          <w:sz w:val="22"/>
-          <w:szCs w:val="22"/>
-        </w:rPr>
-        <w:t xml:space="preserve">Application Lead</w:t>
-      </w:r>
-      <w:r>
-        <w:rPr>
-          <w:rFonts w:ascii="Calibri" w:cs="Calibri" w:eastAsia="Calibri" w:hAnsi="Calibri"/>
-          <w:sz w:val="20"/>
-          <w:szCs w:val="20"/>
-        </w:rPr>
-        <w:t xml:space="preserve">	</w:t>
-      </w:r>
-      <w:r>
-        <w:rPr>
-          <w:rFonts w:ascii="Calibri" w:cs="Calibri" w:eastAsia="Calibri" w:hAnsi="Calibri"/>
-          <w:sz w:val="18"/>
-          <w:szCs w:val="18"/>
-        </w:rPr>
-        <w:t xml:space="preserve">LTIMindtree, India</w:t>
-      </w:r>
-    </w:p>
-    <w:p>
-      <w:pPr>
-        <w:spacing w:after="20"/>
-        <w:ind w:left="1900"/>
-      </w:pPr>
-      <w:r>
-        <w:rPr>
-          <w:rFonts w:ascii="Calibri" w:cs="Calibri" w:eastAsia="Calibri" w:hAnsi="Calibri"/>
-          <w:sz w:val="19"/>
-          <w:szCs w:val="19"/>
-        </w:rPr>
-        <w:t xml:space="preserve">Managed production, UAT and business sign-offs, and coordinated releases through CAB meetings.</w:t>
-      </w:r>
-    </w:p>
-    <w:p>
-      <w:pPr>
-        <w:spacing w:after="20"/>
-        <w:ind w:left="1900"/>
-      </w:pPr>
-      <w:r>
-        <w:rPr>
-          <w:rFonts w:ascii="Calibri" w:cs="Calibri" w:eastAsia="Calibri" w:hAnsi="Calibri"/>
-          <w:sz w:val="19"/>
-          <w:szCs w:val="19"/>
-        </w:rPr>
-        <w:t xml:space="preserve">Resolved defects in shell and Python scripts and Oracle PL/SQL, using SQL tracing to locate faulty procedures and triggers.</w:t>
-      </w:r>
-    </w:p>
-    <w:p>
-      <w:pPr>
-        <w:pBdr>
-          <w:bottom w:val="single" w:color="000000" w:sz="6" w:space="1"/>
-        </w:pBdr>
-        <w:spacing w:after="120" w:before="280"/>
-      </w:pPr>
-      <w:r>
-        <w:rPr>
-          <w:rFonts w:ascii="Calibri" w:cs="Calibri" w:eastAsia="Calibri" w:hAnsi="Calibri"/>
-          <w:sz w:val="24"/>
-          <w:szCs w:val="24"/>
-        </w:rPr>
-        <w:t xml:space="preserve">LANGUAGE SKILLS</w:t>
+          <w:b/>
+          <w:bCs/>
+          <w:sz w:val="20"/>
+          <w:szCs w:val="20"/>
+        </w:rPr>
+        <w:t xml:space="preserve">English: </w:t>
+      </w:r>
+      <w:r>
+        <w:rPr>
+          <w:rFonts w:ascii="Calibri" w:cs="Calibri" w:eastAsia="Calibri" w:hAnsi="Calibri"/>
+          <w:sz w:val="20"/>
+          <w:szCs w:val="20"/>
+        </w:rPr>
+        <w:t xml:space="preserve">[level]</w:t>
       </w:r>
     </w:p>
     <w:p>
@@ -896,7 +1009,7 @@
           <w:sz w:val="20"/>
           <w:szCs w:val="20"/>
         </w:rPr>
-        <w:t xml:space="preserve">English: </w:t>
+        <w:t xml:space="preserve">Norwegian: </w:t>
       </w:r>
       <w:r>
         <w:rPr>
@@ -905,6 +1018,23 @@
           <w:szCs w:val="20"/>
         </w:rPr>
         <w:t xml:space="preserve">[level]</w:t>
+      </w:r>
+    </w:p>
+    <w:p>
+      <w:pPr>
+        <w:keepNext/>
+        <w:pBdr>
+          <w:bottom w:val="single" w:color="000000" w:sz="6" w:space="1"/>
+        </w:pBdr>
+        <w:spacing w:after="120" w:before="280"/>
+      </w:pPr>
+      <w:r>
+        <w:rPr>
+          <w:rFonts w:ascii="Calibri" w:cs="Calibri" w:eastAsia="Calibri" w:hAnsi="Calibri"/>
+          <w:sz w:val="24"/>
+          <w:szCs w:val="24"/>
+        </w:rPr>
+        <w:t xml:space="preserve">IT-SKILLS</w:t>
       </w:r>
     </w:p>
     <w:p>
@@ -924,31 +1054,15 @@
           <w:sz w:val="20"/>
           <w:szCs w:val="20"/>
         </w:rPr>
-        <w:t xml:space="preserve">Norwegian: </w:t>
-      </w:r>
-      <w:r>
-        <w:rPr>
-          <w:rFonts w:ascii="Calibri" w:cs="Calibri" w:eastAsia="Calibri" w:hAnsi="Calibri"/>
-          <w:sz w:val="20"/>
-          <w:szCs w:val="20"/>
-        </w:rPr>
-        <w:t xml:space="preserve">[level]</w:t>
-      </w:r>
-    </w:p>
-    <w:p>
-      <w:pPr>
-        <w:pBdr>
-          <w:bottom w:val="single" w:color="000000" w:sz="6" w:space="1"/>
-        </w:pBdr>
-        <w:spacing w:after="120" w:before="280"/>
-      </w:pPr>
-      <w:r>
-        <w:rPr>
-          <w:rFonts w:ascii="Calibri" w:cs="Calibri" w:eastAsia="Calibri" w:hAnsi="Calibri"/>
-          <w:sz w:val="24"/>
-          <w:szCs w:val="24"/>
-        </w:rPr>
-        <w:t xml:space="preserve">IT-SKILLS</w:t>
+        <w:t xml:space="preserve">Programming and ML: </w:t>
+      </w:r>
+      <w:r>
+        <w:rPr>
+          <w:rFonts w:ascii="Calibri" w:cs="Calibri" w:eastAsia="Calibri" w:hAnsi="Calibri"/>
+          <w:sz w:val="20"/>
+          <w:szCs w:val="20"/>
+        </w:rPr>
+        <w:t xml:space="preserve">Python, PyTorch, TensorFlow, Keras, scikit-learn, SciPy, NumPy</w:t>
       </w:r>
     </w:p>
     <w:p>
@@ -968,15 +1082,15 @@
           <w:sz w:val="20"/>
           <w:szCs w:val="20"/>
         </w:rPr>
-        <w:t xml:space="preserve">Programming and ML: </w:t>
-      </w:r>
-      <w:r>
-        <w:rPr>
-          <w:rFonts w:ascii="Calibri" w:cs="Calibri" w:eastAsia="Calibri" w:hAnsi="Calibri"/>
-          <w:sz w:val="20"/>
-          <w:szCs w:val="20"/>
-        </w:rPr>
-        <w:t xml:space="preserve">Python, PyTorch, TensorFlow, Keras, scikit-learn, SciPy, NumPy</w:t>
+        <w:t xml:space="preserve">Data: </w:t>
+      </w:r>
+      <w:r>
+        <w:rPr>
+          <w:rFonts w:ascii="Calibri" w:cs="Calibri" w:eastAsia="Calibri" w:hAnsi="Calibri"/>
+          <w:sz w:val="20"/>
+          <w:szCs w:val="20"/>
+        </w:rPr>
+        <w:t xml:space="preserve">Oracle SQL, MS SQL, PySpark, BigQuery, MongoDB, Redis, Power BI, Matplotlib, Seaborn, Plotly</w:t>
       </w:r>
     </w:p>
     <w:p>
@@ -996,15 +1110,15 @@
           <w:sz w:val="20"/>
           <w:szCs w:val="20"/>
         </w:rPr>
-        <w:t xml:space="preserve">Data: </w:t>
-      </w:r>
-      <w:r>
-        <w:rPr>
-          <w:rFonts w:ascii="Calibri" w:cs="Calibri" w:eastAsia="Calibri" w:hAnsi="Calibri"/>
-          <w:sz w:val="20"/>
-          <w:szCs w:val="20"/>
-        </w:rPr>
-        <w:t xml:space="preserve">Oracle SQL, MS SQL, PySpark, BigQuery, MongoDB, Redis, Power BI, Matplotlib, Seaborn, Plotly</w:t>
+        <w:t xml:space="preserve">Engineering: </w:t>
+      </w:r>
+      <w:r>
+        <w:rPr>
+          <w:rFonts w:ascii="Calibri" w:cs="Calibri" w:eastAsia="Calibri" w:hAnsi="Calibri"/>
+          <w:sz w:val="20"/>
+          <w:szCs w:val="20"/>
+        </w:rPr>
+        <w:t xml:space="preserve">Git, Bitbucket, Jenkins, Ansible, AWS, GCP, pytest, Agile Scrum</w:t>
       </w:r>
     </w:p>
     <w:p>
@@ -1024,34 +1138,6 @@
           <w:sz w:val="20"/>
           <w:szCs w:val="20"/>
         </w:rPr>
-        <w:t xml:space="preserve">Engineering: </w:t>
-      </w:r>
-      <w:r>
-        <w:rPr>
-          <w:rFonts w:ascii="Calibri" w:cs="Calibri" w:eastAsia="Calibri" w:hAnsi="Calibri"/>
-          <w:sz w:val="20"/>
-          <w:szCs w:val="20"/>
-        </w:rPr>
-        <w:t xml:space="preserve">Git, Bitbucket, Jenkins, Ansible, AWS, GCP, pytest, Agile Scrum</w:t>
-      </w:r>
-    </w:p>
-    <w:p>
-      <w:pPr>
-        <w:pStyle w:val="ListParagraph"/>
-        <w:numPr>
-          <w:ilvl w:val="0"/>
-          <w:numId w:val="2"/>
-        </w:numPr>
-        <w:spacing w:after="40"/>
-      </w:pPr>
-      <w:r>
-        <w:rPr>
-          <w:rFonts w:ascii="Calibri" w:cs="Calibri" w:eastAsia="Calibri" w:hAnsi="Calibri"/>
-          <w:b/>
-          <w:bCs/>
-          <w:sz w:val="20"/>
-          <w:szCs w:val="20"/>
-        </w:rPr>
         <w:t xml:space="preserve">Writing: </w:t>
       </w:r>
       <w:r>
@@ -1065,6 +1151,7 @@
     </w:p>
     <w:p>
       <w:pPr>
+        <w:keepNext/>
         <w:pBdr>
           <w:bottom w:val="single" w:color="000000" w:sz="6" w:space="1"/>
         </w:pBdr>

</xml_diff>